<commit_message>
Update Chapter 5 - Retrieval with header applied and v2 PDF
</commit_message>
<xml_diff>
--- a/chapters/Chapter 05/Chapter 05 - Retrieval.docx
+++ b/chapters/Chapter 05/Chapter 05 - Retrieval.docx
@@ -11204,21 +11204,66 @@
 
 <file path=word/header1.xml><?xml version="1.0" encoding="utf-8"?>
 <w:hdr xmlns:wpc="http://schemas.microsoft.com/office/word/2010/wordprocessingCanvas" xmlns:cx="http://schemas.microsoft.com/office/drawing/2014/chartex" xmlns:cx1="http://schemas.microsoft.com/office/drawing/2015/9/8/chartex" xmlns:cx2="http://schemas.microsoft.com/office/drawing/2015/10/21/chartex" xmlns:cx3="http://schemas.microsoft.com/office/drawing/2016/5/9/chartex" xmlns:cx4="http://schemas.microsoft.com/office/drawing/2016/5/10/chartex" xmlns:cx5="http://schemas.microsoft.com/office/drawing/2016/5/11/chartex" xmlns:cx6="http://schemas.microsoft.com/office/drawing/2016/5/12/chartex" xmlns:cx7="http://schemas.microsoft.com/office/drawing/2016/5/13/chartex" xmlns:cx8="http://schemas.microsoft.com/office/drawing/2016/5/14/chartex" xmlns:mc="http://schemas.openxmlformats.org/markup-compatibility/2006" xmlns:aink="http://schemas.microsoft.com/office/drawing/2016/ink" xmlns:am3d="http://schemas.microsoft.com/office/drawing/2017/model3d" xmlns:o="urn:schemas-microsoft-com:office:office" xmlns:oel="http://schemas.microsoft.com/office/2019/extlst" xmlns:r="http://schemas.openxmlformats.org/officeDocument/2006/relationships" xmlns:m="http://schemas.openxmlformats.org/officeDocument/2006/math" xmlns:v="urn:schemas-microsoft-com:vml" xmlns:wp14="http://schemas.microsoft.com/office/word/2010/wordprocessingDrawing" xmlns:wp="http://schemas.openxmlformats.org/drawingml/2006/wordprocessingDrawing" xmlns:w10="urn:schemas-microsoft-com:office:word" xmlns:w="http://schemas.openxmlformats.org/wordprocessingml/2006/main" xmlns:w14="http://schemas.microsoft.com/office/word/2010/wordml" xmlns:w15="http://schemas.microsoft.com/office/word/2012/wordml" xmlns:w16cex="http://schemas.microsoft.com/office/word/2018/wordml/cex" xmlns:w16cid="http://schemas.microsoft.com/office/word/2016/wordml/cid" xmlns:w16="http://schemas.microsoft.com/office/word/2018/wordml" xmlns:w16du="http://schemas.microsoft.com/office/word/2023/wordml/word16du" xmlns:w16sdtdh="http://schemas.microsoft.com/office/word/2020/wordml/sdtdatahash" xmlns:w16sdtfl="http://schemas.microsoft.com/office/word/2024/wordml/sdtformatlock" xmlns:w16se="http://schemas.microsoft.com/office/word/2015/wordml/symex" xmlns:wpg="http://schemas.microsoft.com/office/word/2010/wordprocessingGroup" xmlns:wpi="http://schemas.microsoft.com/office/word/2010/wordprocessingInk" xmlns:wne="http://schemas.microsoft.com/office/word/2006/wordml" xmlns:wps="http://schemas.microsoft.com/office/word/2010/wordprocessingShape" mc:Ignorable="w14 w15 w16se w16cid w16 w16cex w16sdtdh w16sdtfl w16du wp14">
-  <w:p>
-    <w:pPr>
-      <w:jc w:val="right"/>
-    </w:pPr>
-    <w:r>
-      <w:rPr>
-        <w:i/>
-        <w:iCs/>
-        <w:color w:val="888888"/>
-        <w:sz w:val="20"/>
-        <w:szCs w:val="20"/>
-      </w:rPr>
-      <w:t>AI-Powered Personalization</w:t>
-    </w:r>
-  </w:p>
+  <w:tbl>
+    <w:tblPr>
+      <w:tblW w:type="auto" w:w="0"/>
+      <w:tblLayout w:type="fixed"/>
+      <w:tblLook w:firstColumn="1" w:firstRow="1" w:lastColumn="0" w:lastRow="0" w:noHBand="0" w:noVBand="1" w:val="04A0"/>
+      <w:tblBorders>
+        <w:top w:val="nil"/>
+        <w:left w:val="nil"/>
+        <w:bottom w:val="nil"/>
+        <w:right w:val="nil"/>
+        <w:insideH w:val="nil"/>
+        <w:insideV w:val="nil"/>
+      </w:tblBorders>
+    </w:tblPr>
+    <w:tblGrid>
+      <w:gridCol w:w="4680"/>
+      <w:gridCol w:w="4680"/>
+    </w:tblGrid>
+    <w:tr>
+      <w:tc>
+        <w:tcPr>
+          <w:tcW w:type="dxa" w:w="4680"/>
+          <w:vAlign w:val="center"/>
+        </w:tcPr>
+        <w:p>
+          <w:pPr>
+            <w:jc w:val="left"/>
+          </w:pPr>
+          <w:r>
+            <w:rPr>
+              <w:rFonts w:ascii="Calibri" w:hAnsi="Calibri"/>
+              <w:color w:val="BFBFBF"/>
+              <w:sz w:val="18"/>
+            </w:rPr>
+            <w:t>AI-Powered Personalization</w:t>
+          </w:r>
+        </w:p>
+      </w:tc>
+      <w:tc>
+        <w:tcPr>
+          <w:tcW w:type="dxa" w:w="4680"/>
+          <w:vAlign w:val="center"/>
+        </w:tcPr>
+        <w:p>
+          <w:pPr>
+            <w:jc w:val="right"/>
+          </w:pPr>
+          <w:r>
+            <w:rPr>
+              <w:rFonts w:ascii="Calibri" w:hAnsi="Calibri"/>
+              <w:color w:val="BFBFBF"/>
+              <w:sz w:val="18"/>
+            </w:rPr>
+            <w:t>Shreesha Jagadeesh</w:t>
+          </w:r>
+        </w:p>
+      </w:tc>
+    </w:tr>
+  </w:tbl>
+  <w:p/>
 </w:hdr>
 </file>
 

</xml_diff>